<commit_message>
Docs: rider guide and next-round notes
</commit_message>
<xml_diff>
--- a/369_Delivery_Partner_Guide.docx
+++ b/369_Delivery_Partner_Guide.docx
@@ -983,6 +983,42 @@
           <w:sz w:val="21"/>
         </w:rPr>
         <w:t>Decisions still open</w:t>
+      </w:r>
+    </w:p>
+    <w:p>
+      <w:pPr>
+        <w:spacing w:after="60" w:line="264" w:lineRule="auto"/>
+        <w:ind w:left="403"/>
+      </w:pPr>
+      <w:r>
+        <w:rPr>
+          <w:rFonts w:ascii="Calibri" w:hAnsi="Calibri" w:cs="Calibri" w:eastAsia="Calibri"/>
+          <w:b/>
+          <w:i w:val="0"/>
+          <w:color w:val="1A1A1A"/>
+          <w:sz w:val="21"/>
+        </w:rPr>
+        <w:t xml:space="preserve">•  </w:t>
+      </w:r>
+      <w:r>
+        <w:rPr>
+          <w:rFonts w:ascii="Calibri" w:hAnsi="Calibri" w:cs="Calibri" w:eastAsia="Calibri"/>
+          <w:b/>
+          <w:i w:val="0"/>
+          <w:color w:val="16539B"/>
+          <w:sz w:val="21"/>
+        </w:rPr>
+        <w:t xml:space="preserve">12.  </w:t>
+      </w:r>
+      <w:r>
+        <w:rPr>
+          <w:rFonts w:ascii="Calibri" w:hAnsi="Calibri" w:cs="Calibri" w:eastAsia="Calibri"/>
+          <w:b w:val="0"/>
+          <w:i w:val="0"/>
+          <w:color w:val="1A1A1A"/>
+          <w:sz w:val="21"/>
+        </w:rPr>
+        <w:t xml:space="preserve">What the app does today</w:t>
       </w:r>
     </w:p>
     <w:p/>
@@ -12029,6 +12065,857 @@
     <w:p>
       <w:pPr>
         <w:spacing w:after="80"/>
+      </w:pPr>
+    </w:p>
+    <w:p>
+      <w:pPr>
+        <w:spacing w:after="120"/>
+      </w:pPr>
+    </w:p>
+    <w:p>
+      <w:pPr>
+        <w:pageBreakBefore/>
+        <w:keepNext/>
+        <w:spacing w:before="40" w:after="160"/>
+        <w:shd w:val="clear" w:color="auto" w:fill="16539B"/>
+      </w:pPr>
+      <w:r>
+        <w:rPr>
+          <w:rFonts w:ascii="Calibri" w:hAnsi="Calibri" w:cs="Calibri" w:eastAsia="Calibri"/>
+          <w:b/>
+          <w:i w:val="0"/>
+          <w:color w:val="FFFFFF"/>
+          <w:sz w:val="28"/>
+        </w:rPr>
+        <w:t xml:space="preserve">  12.  What the app does today  (October 2026)</w:t>
+      </w:r>
+    </w:p>
+    <w:p>
+      <w:pPr>
+        <w:spacing w:after="120" w:line="269" w:lineRule="auto"/>
+      </w:pPr>
+      <w:r>
+        <w:rPr>
+          <w:rFonts w:ascii="Calibri" w:hAnsi="Calibri" w:cs="Calibri" w:eastAsia="Calibri"/>
+          <w:b w:val="0"/>
+          <w:i w:val="0"/>
+          <w:color w:val="1A1A1A"/>
+          <w:sz w:val="21"/>
+        </w:rPr>
+        <w:t xml:space="preserve">Sections 1 to 11 are the original plan. This section is what the 369 Delivery Partner app actually does now, on the Odoo 19 server (sales_automation_delivery 19.0.22.9.0). Where the two differ, this section is right: for example, the customer's code is 6 digits, not 4.</w:t>
+      </w:r>
+    </w:p>
+    <w:p>
+      <w:pPr>
+        <w:keepNext/>
+        <w:spacing w:before="200" w:after="80"/>
+      </w:pPr>
+      <w:r>
+        <w:rPr>
+          <w:rFonts w:ascii="Calibri" w:hAnsi="Calibri" w:cs="Calibri" w:eastAsia="Calibri"/>
+          <w:b/>
+          <w:i w:val="0"/>
+          <w:color w:val="16539B"/>
+          <w:sz w:val="24"/>
+        </w:rPr>
+        <w:t xml:space="preserve">Signing in</w:t>
+      </w:r>
+    </w:p>
+    <w:p>
+      <w:pPr>
+        <w:spacing w:after="60" w:line="264" w:lineRule="auto"/>
+        <w:ind w:left="403"/>
+      </w:pPr>
+      <w:r>
+        <w:rPr>
+          <w:rFonts w:ascii="Calibri" w:hAnsi="Calibri" w:cs="Calibri" w:eastAsia="Calibri"/>
+          <w:b/>
+          <w:i w:val="0"/>
+          <w:color w:val="16539B"/>
+          <w:sz w:val="21"/>
+        </w:rPr>
+        <w:t xml:space="preserve">•  </w:t>
+      </w:r>
+      <w:r>
+        <w:rPr>
+          <w:rFonts w:ascii="Calibri" w:hAnsi="Calibri" w:cs="Calibri" w:eastAsia="Calibri"/>
+          <w:b/>
+          <w:i w:val="0"/>
+          <w:color w:val="16539B"/>
+          <w:sz w:val="21"/>
+        </w:rPr>
+        <w:t xml:space="preserve">Pick a role first: </w:t>
+      </w:r>
+      <w:r>
+        <w:rPr>
+          <w:rFonts w:ascii="Calibri" w:hAnsi="Calibri" w:cs="Calibri" w:eastAsia="Calibri"/>
+          <w:b w:val="0"/>
+          <w:i w:val="0"/>
+          <w:color w:val="1A1A1A"/>
+          <w:sz w:val="21"/>
+        </w:rPr>
+        <w:t xml:space="preserve">Office rider (staff of the shop, on salary) or Delivery Partner (paid per delivery). The phone remembers the choice.</w:t>
+      </w:r>
+    </w:p>
+    <w:p>
+      <w:pPr>
+        <w:spacing w:after="60" w:line="264" w:lineRule="auto"/>
+        <w:ind w:left="403"/>
+      </w:pPr>
+      <w:r>
+        <w:rPr>
+          <w:rFonts w:ascii="Calibri" w:hAnsi="Calibri" w:cs="Calibri" w:eastAsia="Calibri"/>
+          <w:b/>
+          <w:i w:val="0"/>
+          <w:color w:val="16539B"/>
+          <w:sz w:val="21"/>
+        </w:rPr>
+        <w:t xml:space="preserve">•  </w:t>
+      </w:r>
+      <w:r>
+        <w:rPr>
+          <w:rFonts w:ascii="Calibri" w:hAnsi="Calibri" w:cs="Calibri" w:eastAsia="Calibri"/>
+          <w:b/>
+          <w:i w:val="0"/>
+          <w:color w:val="16539B"/>
+          <w:sz w:val="21"/>
+        </w:rPr>
+        <w:t xml:space="preserve">Then the WhatsApp number </w:t>
+      </w:r>
+      <w:r>
+        <w:rPr>
+          <w:rFonts w:ascii="Calibri" w:hAnsi="Calibri" w:cs="Calibri" w:eastAsia="Calibri"/>
+          <w:b w:val="0"/>
+          <w:i w:val="0"/>
+          <w:color w:val="1A1A1A"/>
+          <w:sz w:val="21"/>
+        </w:rPr>
+        <w:t xml:space="preserve">and a 6-digit code sent on WhatsApp. No password.</w:t>
+      </w:r>
+    </w:p>
+    <w:p>
+      <w:pPr>
+        <w:spacing w:after="60" w:line="264" w:lineRule="auto"/>
+        <w:ind w:left="403"/>
+      </w:pPr>
+      <w:r>
+        <w:rPr>
+          <w:rFonts w:ascii="Calibri" w:hAnsi="Calibri" w:cs="Calibri" w:eastAsia="Calibri"/>
+          <w:b/>
+          <w:i w:val="0"/>
+          <w:color w:val="16539B"/>
+          <w:sz w:val="21"/>
+        </w:rPr>
+        <w:t xml:space="preserve">•  </w:t>
+      </w:r>
+      <w:r>
+        <w:rPr>
+          <w:rFonts w:ascii="Calibri" w:hAnsi="Calibri" w:cs="Calibri" w:eastAsia="Calibri"/>
+          <w:b/>
+          <w:i w:val="0"/>
+          <w:color w:val="16539B"/>
+          <w:sz w:val="21"/>
+        </w:rPr>
+        <w:t xml:space="preserve">Wrong role? </w:t>
+      </w:r>
+      <w:r>
+        <w:rPr>
+          <w:rFonts w:ascii="Calibri" w:hAnsi="Calibri" w:cs="Calibri" w:eastAsia="Calibri"/>
+          <w:b w:val="0"/>
+          <w:i w:val="0"/>
+          <w:color w:val="1A1A1A"/>
+          <w:sz w:val="21"/>
+        </w:rPr>
+        <w:t xml:space="preserve">The server checks before any code is sent: "This number is registered as an Office rider. Choose Office rider and sign in again."</w:t>
+      </w:r>
+    </w:p>
+    <w:p>
+      <w:pPr>
+        <w:keepNext/>
+        <w:spacing w:before="200" w:after="80"/>
+      </w:pPr>
+      <w:r>
+        <w:rPr>
+          <w:rFonts w:ascii="Calibri" w:hAnsi="Calibri" w:cs="Calibri" w:eastAsia="Calibri"/>
+          <w:b/>
+          <w:i w:val="0"/>
+          <w:color w:val="16539B"/>
+          <w:sz w:val="24"/>
+        </w:rPr>
+        <w:t xml:space="preserve">At the customer's door</w:t>
+      </w:r>
+    </w:p>
+    <w:p>
+      <w:pPr>
+        <w:spacing w:after="60" w:line="264" w:lineRule="auto"/>
+        <w:ind w:left="403"/>
+      </w:pPr>
+      <w:r>
+        <w:rPr>
+          <w:rFonts w:ascii="Calibri" w:hAnsi="Calibri" w:cs="Calibri" w:eastAsia="Calibri"/>
+          <w:b/>
+          <w:i w:val="0"/>
+          <w:color w:val="16539B"/>
+          <w:sz w:val="21"/>
+        </w:rPr>
+        <w:t xml:space="preserve">•  </w:t>
+      </w:r>
+      <w:r>
+        <w:rPr>
+          <w:rFonts w:ascii="Calibri" w:hAnsi="Calibri" w:cs="Calibri" w:eastAsia="Calibri"/>
+          <w:b/>
+          <w:i w:val="0"/>
+          <w:color w:val="16539B"/>
+          <w:sz w:val="21"/>
+        </w:rPr>
+        <w:t xml:space="preserve">Tap Reached: </w:t>
+      </w:r>
+      <w:r>
+        <w:rPr>
+          <w:rFonts w:ascii="Calibri" w:hAnsi="Calibri" w:cs="Calibri" w:eastAsia="Calibri"/>
+          <w:b w:val="0"/>
+          <w:i w:val="0"/>
+          <w:color w:val="1A1A1A"/>
+          <w:sz w:val="21"/>
+        </w:rPr>
+        <w:t xml:space="preserve">the customer gets a 6-digit code on WhatsApp.</w:t>
+      </w:r>
+    </w:p>
+    <w:p>
+      <w:pPr>
+        <w:spacing w:after="60" w:line="264" w:lineRule="auto"/>
+        <w:ind w:left="403"/>
+      </w:pPr>
+      <w:r>
+        <w:rPr>
+          <w:rFonts w:ascii="Calibri" w:hAnsi="Calibri" w:cs="Calibri" w:eastAsia="Calibri"/>
+          <w:b/>
+          <w:i w:val="0"/>
+          <w:color w:val="16539B"/>
+          <w:sz w:val="21"/>
+        </w:rPr>
+        <w:t xml:space="preserve">•  </w:t>
+      </w:r>
+      <w:r>
+        <w:rPr>
+          <w:rFonts w:ascii="Calibri" w:hAnsi="Calibri" w:cs="Calibri" w:eastAsia="Calibri"/>
+          <w:b/>
+          <w:i w:val="0"/>
+          <w:color w:val="16539B"/>
+          <w:sz w:val="21"/>
+        </w:rPr>
+        <w:t xml:space="preserve">Code did not arrive? </w:t>
+      </w:r>
+      <w:r>
+        <w:rPr>
+          <w:rFonts w:ascii="Calibri" w:hAnsi="Calibri" w:cs="Calibri" w:eastAsia="Calibri"/>
+          <w:b w:val="0"/>
+          <w:i w:val="0"/>
+          <w:color w:val="1A1A1A"/>
+          <w:sz w:val="21"/>
+        </w:rPr>
+        <w:t xml:space="preserve">"Didn't get it? Resend code" sends a new one: up to 5 per job, one minute apart. The old code stops working.</w:t>
+      </w:r>
+    </w:p>
+    <w:p>
+      <w:pPr>
+        <w:spacing w:after="60" w:line="264" w:lineRule="auto"/>
+        <w:ind w:left="403"/>
+      </w:pPr>
+      <w:r>
+        <w:rPr>
+          <w:rFonts w:ascii="Calibri" w:hAnsi="Calibri" w:cs="Calibri" w:eastAsia="Calibri"/>
+          <w:b/>
+          <w:i w:val="0"/>
+          <w:color w:val="1A6B33"/>
+          <w:sz w:val="21"/>
+        </w:rPr>
+        <w:t xml:space="preserve">•  </w:t>
+      </w:r>
+      <w:r>
+        <w:rPr>
+          <w:rFonts w:ascii="Calibri" w:hAnsi="Calibri" w:cs="Calibri" w:eastAsia="Calibri"/>
+          <w:b/>
+          <w:i w:val="0"/>
+          <w:color w:val="1A6B33"/>
+          <w:sz w:val="21"/>
+        </w:rPr>
+        <w:t xml:space="preserve">Near the customer by itself: </w:t>
+      </w:r>
+      <w:r>
+        <w:rPr>
+          <w:rFonts w:ascii="Calibri" w:hAnsi="Calibri" w:cs="Calibri" w:eastAsia="Calibri"/>
+          <w:b w:val="0"/>
+          <w:i w:val="0"/>
+          <w:color w:val="1A1A1A"/>
+          <w:sz w:val="21"/>
+        </w:rPr>
+        <w:t xml:space="preserve">when the customer has shared a WhatsApp location pin, the server marks the rider near within 300 m and tells the customer on WhatsApp. No tap needed.</w:t>
+      </w:r>
+    </w:p>
+    <w:p>
+      <w:pPr>
+        <w:keepNext/>
+        <w:spacing w:before="200" w:after="80"/>
+      </w:pPr>
+      <w:r>
+        <w:rPr>
+          <w:rFonts w:ascii="Calibri" w:hAnsi="Calibri" w:cs="Calibri" w:eastAsia="Calibri"/>
+          <w:b/>
+          <w:i w:val="0"/>
+          <w:color w:val="16539B"/>
+          <w:sz w:val="24"/>
+        </w:rPr>
+        <w:t xml:space="preserve">Parcel photos</w:t>
+      </w:r>
+    </w:p>
+    <w:p>
+      <w:pPr>
+        <w:spacing w:after="60" w:line="264" w:lineRule="auto"/>
+        <w:ind w:left="403"/>
+      </w:pPr>
+      <w:r>
+        <w:rPr>
+          <w:rFonts w:ascii="Calibri" w:hAnsi="Calibri" w:cs="Calibri" w:eastAsia="Calibri"/>
+          <w:b/>
+          <w:i w:val="0"/>
+          <w:color w:val="16539B"/>
+          <w:sz w:val="21"/>
+        </w:rPr>
+        <w:t xml:space="preserve">•  </w:t>
+      </w:r>
+      <w:r>
+        <w:rPr>
+          <w:rFonts w:ascii="Calibri" w:hAnsi="Calibri" w:cs="Calibri" w:eastAsia="Calibri"/>
+          <w:b/>
+          <w:i w:val="0"/>
+          <w:color w:val="16539B"/>
+          <w:sz w:val="21"/>
+        </w:rPr>
+        <w:t xml:space="preserve">After both codes: </w:t>
+      </w:r>
+      <w:r>
+        <w:rPr>
+          <w:rFonts w:ascii="Calibri" w:hAnsi="Calibri" w:cs="Calibri" w:eastAsia="Calibri"/>
+          <w:b w:val="0"/>
+          <w:i w:val="0"/>
+          <w:color w:val="1A1A1A"/>
+          <w:sz w:val="21"/>
+        </w:rPr>
+        <w:t xml:space="preserve">after the pickup code and after the customer's code, the app shows a shot list.</w:t>
+      </w:r>
+    </w:p>
+    <w:p>
+      <w:pPr>
+        <w:spacing w:after="60" w:line="264" w:lineRule="auto"/>
+        <w:ind w:left="403"/>
+      </w:pPr>
+      <w:r>
+        <w:rPr>
+          <w:rFonts w:ascii="Calibri" w:hAnsi="Calibri" w:cs="Calibri" w:eastAsia="Calibri"/>
+          <w:b/>
+          <w:i w:val="0"/>
+          <w:color w:val="16539B"/>
+          <w:sz w:val="21"/>
+        </w:rPr>
+        <w:t xml:space="preserve">•  </w:t>
+      </w:r>
+      <w:r>
+        <w:rPr>
+          <w:rFonts w:ascii="Calibri" w:hAnsi="Calibri" w:cs="Calibri" w:eastAsia="Calibri"/>
+          <w:b/>
+          <w:i w:val="0"/>
+          <w:color w:val="16539B"/>
+          <w:sz w:val="21"/>
+        </w:rPr>
+        <w:t xml:space="preserve">Two are needed: </w:t>
+      </w:r>
+      <w:r>
+        <w:rPr>
+          <w:rFonts w:ascii="Calibri" w:hAnsi="Calibri" w:cs="Calibri" w:eastAsia="Calibri"/>
+          <w:b w:val="0"/>
+          <w:i w:val="0"/>
+          <w:color w:val="1A1A1A"/>
+          <w:sz w:val="21"/>
+        </w:rPr>
+        <w:t xml:space="preserve">1  Whole parcel, and 2  Label and seal. Photos 3 and 4 are optional (where it was left, anything wrong).</w:t>
+      </w:r>
+    </w:p>
+    <w:p>
+      <w:pPr>
+        <w:spacing w:after="60" w:line="264" w:lineRule="auto"/>
+        <w:ind w:left="403"/>
+      </w:pPr>
+      <w:r>
+        <w:rPr>
+          <w:rFonts w:ascii="Calibri" w:hAnsi="Calibri" w:cs="Calibri" w:eastAsia="Calibri"/>
+          <w:b/>
+          <w:i w:val="0"/>
+          <w:color w:val="16539B"/>
+          <w:sz w:val="21"/>
+        </w:rPr>
+        <w:t xml:space="preserve">•  </w:t>
+      </w:r>
+      <w:r>
+        <w:rPr>
+          <w:rFonts w:ascii="Calibri" w:hAnsi="Calibri" w:cs="Calibri" w:eastAsia="Calibri"/>
+          <w:b/>
+          <w:i w:val="0"/>
+          <w:color w:val="16539B"/>
+          <w:sz w:val="21"/>
+        </w:rPr>
+        <w:t xml:space="preserve">Check before sending: </w:t>
+      </w:r>
+      <w:r>
+        <w:rPr>
+          <w:rFonts w:ascii="Calibri" w:hAnsi="Calibri" w:cs="Calibri" w:eastAsia="Calibri"/>
+          <w:b w:val="0"/>
+          <w:i w:val="0"/>
+          <w:color w:val="1A1A1A"/>
+          <w:sz w:val="21"/>
+        </w:rPr>
+        <w:t xml:space="preserve">each photo shows when it was taken and can be retaken. While sending, each row shows "Sending" or "Sent", so a weak signal loses nothing.</w:t>
+      </w:r>
+    </w:p>
+    <w:p>
+      <w:pPr>
+        <w:spacing w:after="60" w:line="264" w:lineRule="auto"/>
+        <w:ind w:left="403"/>
+      </w:pPr>
+      <w:r>
+        <w:rPr>
+          <w:rFonts w:ascii="Calibri" w:hAnsi="Calibri" w:cs="Calibri" w:eastAsia="Calibri"/>
+          <w:b/>
+          <w:i w:val="0"/>
+          <w:color w:val="16539B"/>
+          <w:sz w:val="21"/>
+        </w:rPr>
+        <w:t xml:space="preserve">•  </w:t>
+      </w:r>
+      <w:r>
+        <w:rPr>
+          <w:rFonts w:ascii="Calibri" w:hAnsi="Calibri" w:cs="Calibri" w:eastAsia="Calibri"/>
+          <w:b/>
+          <w:i w:val="0"/>
+          <w:color w:val="16539B"/>
+          <w:sz w:val="21"/>
+        </w:rPr>
+        <w:t xml:space="preserve">Names: </w:t>
+      </w:r>
+      <w:r>
+        <w:rPr>
+          <w:rFonts w:ascii="Calibri" w:hAnsi="Calibri" w:cs="Calibri" w:eastAsia="Calibri"/>
+          <w:b w:val="0"/>
+          <w:i w:val="0"/>
+          <w:color w:val="1A1A1A"/>
+          <w:sz w:val="21"/>
+        </w:rPr>
+        <w:t xml:space="preserve">order, date and time in the company's time zone, e.g. S00042_061026_173915.jpg. Past jobs show their photos.</w:t>
+      </w:r>
+    </w:p>
+    <w:p>
+      <w:pPr>
+        <w:keepNext/>
+        <w:spacing w:before="200" w:after="80"/>
+      </w:pPr>
+      <w:r>
+        <w:rPr>
+          <w:rFonts w:ascii="Calibri" w:hAnsi="Calibri" w:cs="Calibri" w:eastAsia="Calibri"/>
+          <w:b/>
+          <w:i w:val="0"/>
+          <w:color w:val="16539B"/>
+          <w:sz w:val="24"/>
+        </w:rPr>
+        <w:t xml:space="preserve">After delivery</w:t>
+      </w:r>
+    </w:p>
+    <w:p>
+      <w:pPr>
+        <w:spacing w:after="60" w:line="264" w:lineRule="auto"/>
+        <w:ind w:left="403"/>
+      </w:pPr>
+      <w:r>
+        <w:rPr>
+          <w:rFonts w:ascii="Calibri" w:hAnsi="Calibri" w:cs="Calibri" w:eastAsia="Calibri"/>
+          <w:b/>
+          <w:i w:val="0"/>
+          <w:color w:val="1A6B33"/>
+          <w:sz w:val="21"/>
+        </w:rPr>
+        <w:t xml:space="preserve">•  </w:t>
+      </w:r>
+      <w:r>
+        <w:rPr>
+          <w:rFonts w:ascii="Calibri" w:hAnsi="Calibri" w:cs="Calibri" w:eastAsia="Calibri"/>
+          <w:b/>
+          <w:i w:val="0"/>
+          <w:color w:val="1A6B33"/>
+          <w:sz w:val="21"/>
+        </w:rPr>
+        <w:t xml:space="preserve">Thank-you screen: </w:t>
+      </w:r>
+      <w:r>
+        <w:rPr>
+          <w:rFonts w:ascii="Calibri" w:hAnsi="Calibri" w:cs="Calibri" w:eastAsia="Calibri"/>
+          <w:b w:val="0"/>
+          <w:i w:val="0"/>
+          <w:color w:val="1A1A1A"/>
+          <w:sz w:val="21"/>
+        </w:rPr>
+        <w:t xml:space="preserve">a green tick, the order, the customer, the time and, for Delivery Partners, the trip pay. Back to jobs by the button or by itself after 8 seconds.</w:t>
+      </w:r>
+    </w:p>
+    <w:p>
+      <w:pPr>
+        <w:spacing w:after="60" w:line="264" w:lineRule="auto"/>
+        <w:ind w:left="403"/>
+      </w:pPr>
+      <w:r>
+        <w:rPr>
+          <w:rFonts w:ascii="Calibri" w:hAnsi="Calibri" w:cs="Calibri" w:eastAsia="Calibri"/>
+          <w:b/>
+          <w:i w:val="0"/>
+          <w:color w:val="1A6B33"/>
+          <w:sz w:val="21"/>
+        </w:rPr>
+        <w:t xml:space="preserve">•  </w:t>
+      </w:r>
+      <w:r>
+        <w:rPr>
+          <w:rFonts w:ascii="Calibri" w:hAnsi="Calibri" w:cs="Calibri" w:eastAsia="Calibri"/>
+          <w:b/>
+          <w:i w:val="0"/>
+          <w:color w:val="1A6B33"/>
+          <w:sz w:val="21"/>
+        </w:rPr>
+        <w:t xml:space="preserve">The customer </w:t>
+      </w:r>
+      <w:r>
+        <w:rPr>
+          <w:rFonts w:ascii="Calibri" w:hAnsi="Calibri" w:cs="Calibri" w:eastAsia="Calibri"/>
+          <w:b w:val="0"/>
+          <w:i w:val="0"/>
+          <w:color w:val="1A1A1A"/>
+          <w:sz w:val="21"/>
+        </w:rPr>
+        <w:t xml:space="preserve">gets: "Your order #S00042 was delivered at 17:39 by bala. Thank you for shopping with us!"</w:t>
+      </w:r>
+    </w:p>
+    <w:p>
+      <w:pPr>
+        <w:keepNext/>
+        <w:spacing w:before="200" w:after="80"/>
+      </w:pPr>
+      <w:r>
+        <w:rPr>
+          <w:rFonts w:ascii="Calibri" w:hAnsi="Calibri" w:cs="Calibri" w:eastAsia="Calibri"/>
+          <w:b/>
+          <w:i w:val="0"/>
+          <w:color w:val="16539B"/>
+          <w:sz w:val="24"/>
+        </w:rPr>
+        <w:t xml:space="preserve">Pay</w:t>
+      </w:r>
+    </w:p>
+    <w:p>
+      <w:pPr>
+        <w:spacing w:after="60" w:line="264" w:lineRule="auto"/>
+        <w:ind w:left="403"/>
+      </w:pPr>
+      <w:r>
+        <w:rPr>
+          <w:rFonts w:ascii="Calibri" w:hAnsi="Calibri" w:cs="Calibri" w:eastAsia="Calibri"/>
+          <w:b/>
+          <w:i w:val="0"/>
+          <w:color w:val="1A6B33"/>
+          <w:sz w:val="21"/>
+        </w:rPr>
+        <w:t xml:space="preserve">•  </w:t>
+      </w:r>
+      <w:r>
+        <w:rPr>
+          <w:rFonts w:ascii="Calibri" w:hAnsi="Calibri" w:cs="Calibri" w:eastAsia="Calibri"/>
+          <w:b/>
+          <w:i w:val="0"/>
+          <w:color w:val="1A6B33"/>
+          <w:sz w:val="21"/>
+        </w:rPr>
+        <w:t xml:space="preserve">Office riders: </w:t>
+      </w:r>
+      <w:r>
+        <w:rPr>
+          <w:rFonts w:ascii="Calibri" w:hAnsi="Calibri" w:cs="Calibri" w:eastAsia="Calibri"/>
+          <w:b w:val="0"/>
+          <w:i w:val="0"/>
+          <w:color w:val="1A1A1A"/>
+          <w:sz w:val="21"/>
+        </w:rPr>
+        <w:t xml:space="preserve">deliveries done, time on duty and cash carried. No money shown.</w:t>
+      </w:r>
+    </w:p>
+    <w:p>
+      <w:pPr>
+        <w:spacing w:after="60" w:line="264" w:lineRule="auto"/>
+        <w:ind w:left="403"/>
+      </w:pPr>
+      <w:r>
+        <w:rPr>
+          <w:rFonts w:ascii="Calibri" w:hAnsi="Calibri" w:cs="Calibri" w:eastAsia="Calibri"/>
+          <w:b/>
+          <w:i w:val="0"/>
+          <w:color w:val="1A6B33"/>
+          <w:sz w:val="21"/>
+        </w:rPr>
+        <w:t xml:space="preserve">•  </w:t>
+      </w:r>
+      <w:r>
+        <w:rPr>
+          <w:rFonts w:ascii="Calibri" w:hAnsi="Calibri" w:cs="Calibri" w:eastAsia="Calibri"/>
+          <w:b/>
+          <w:i w:val="0"/>
+          <w:color w:val="1A6B33"/>
+          <w:sz w:val="21"/>
+        </w:rPr>
+        <w:t xml:space="preserve">Delivery Partners: </w:t>
+      </w:r>
+      <w:r>
+        <w:rPr>
+          <w:rFonts w:ascii="Calibri" w:hAnsi="Calibri" w:cs="Calibri" w:eastAsia="Calibri"/>
+          <w:b w:val="0"/>
+          <w:i w:val="0"/>
+          <w:color w:val="1A1A1A"/>
+          <w:sz w:val="21"/>
+        </w:rPr>
+        <w:t xml:space="preserve">pay per trip from the rates in Delivery Settings (base, km included, per km after, Express bonus), shown for today, this week, this month and all time.</w:t>
+      </w:r>
+    </w:p>
+    <w:p>
+      <w:pPr>
+        <w:keepNext/>
+        <w:spacing w:before="200" w:after="80"/>
+      </w:pPr>
+      <w:r>
+        <w:rPr>
+          <w:rFonts w:ascii="Calibri" w:hAnsi="Calibri" w:cs="Calibri" w:eastAsia="Calibri"/>
+          <w:b/>
+          <w:i w:val="0"/>
+          <w:color w:val="16539B"/>
+          <w:sz w:val="24"/>
+        </w:rPr>
+        <w:t xml:space="preserve">Safety nets</w:t>
+      </w:r>
+    </w:p>
+    <w:p>
+      <w:pPr>
+        <w:spacing w:after="60" w:line="264" w:lineRule="auto"/>
+        <w:ind w:left="403"/>
+      </w:pPr>
+      <w:r>
+        <w:rPr>
+          <w:rFonts w:ascii="Calibri" w:hAnsi="Calibri" w:cs="Calibri" w:eastAsia="Calibri"/>
+          <w:b/>
+          <w:i w:val="0"/>
+          <w:color w:val="1A6B33"/>
+          <w:sz w:val="21"/>
+        </w:rPr>
+        <w:t xml:space="preserve">•  </w:t>
+      </w:r>
+      <w:r>
+        <w:rPr>
+          <w:rFonts w:ascii="Calibri" w:hAnsi="Calibri" w:cs="Calibri" w:eastAsia="Calibri"/>
+          <w:b/>
+          <w:i w:val="0"/>
+          <w:color w:val="1A6B33"/>
+          <w:sz w:val="21"/>
+        </w:rPr>
+        <w:t xml:space="preserve">Packed before payment: </w:t>
+      </w:r>
+      <w:r>
+        <w:rPr>
+          <w:rFonts w:ascii="Calibri" w:hAnsi="Calibri" w:cs="Calibri" w:eastAsia="Calibri"/>
+          <w:b w:val="0"/>
+          <w:i w:val="0"/>
+          <w:color w:val="1A1A1A"/>
+          <w:sz w:val="21"/>
+        </w:rPr>
+        <w:t xml:space="preserve">the shop can press Packed while the customer has not paid; the rider is called by itself when the payment lands. No error popup.</w:t>
+      </w:r>
+    </w:p>
+    <w:p>
+      <w:pPr>
+        <w:spacing w:after="60" w:line="264" w:lineRule="auto"/>
+        <w:ind w:left="403"/>
+      </w:pPr>
+      <w:r>
+        <w:rPr>
+          <w:rFonts w:ascii="Calibri" w:hAnsi="Calibri" w:cs="Calibri" w:eastAsia="Calibri"/>
+          <w:b/>
+          <w:i w:val="0"/>
+          <w:color w:val="1A6B33"/>
+          <w:sz w:val="21"/>
+        </w:rPr>
+        <w:t xml:space="preserve">•  </w:t>
+      </w:r>
+      <w:r>
+        <w:rPr>
+          <w:rFonts w:ascii="Calibri" w:hAnsi="Calibri" w:cs="Calibri" w:eastAsia="Calibri"/>
+          <w:b/>
+          <w:i w:val="0"/>
+          <w:color w:val="1A6B33"/>
+          <w:sz w:val="21"/>
+        </w:rPr>
+        <w:t xml:space="preserve">No signal: </w:t>
+      </w:r>
+      <w:r>
+        <w:rPr>
+          <w:rFonts w:ascii="Calibri" w:hAnsi="Calibri" w:cs="Calibri" w:eastAsia="Calibri"/>
+          <w:b w:val="0"/>
+          <w:i w:val="0"/>
+          <w:color w:val="1A1A1A"/>
+          <w:sz w:val="21"/>
+        </w:rPr>
+        <w:t xml:space="preserve">steps tapped with no signal are sent by themselves when the signal is back.</w:t>
+      </w:r>
+    </w:p>
+    <w:p>
+      <w:pPr>
+        <w:spacing w:after="60" w:line="264" w:lineRule="auto"/>
+        <w:ind w:left="403"/>
+      </w:pPr>
+      <w:r>
+        <w:rPr>
+          <w:rFonts w:ascii="Calibri" w:hAnsi="Calibri" w:cs="Calibri" w:eastAsia="Calibri"/>
+          <w:b/>
+          <w:i w:val="0"/>
+          <w:color w:val="B3241A"/>
+          <w:sz w:val="21"/>
+        </w:rPr>
+        <w:t xml:space="preserve">•  </w:t>
+      </w:r>
+      <w:r>
+        <w:rPr>
+          <w:rFonts w:ascii="Calibri" w:hAnsi="Calibri" w:cs="Calibri" w:eastAsia="Calibri"/>
+          <w:b/>
+          <w:i w:val="0"/>
+          <w:color w:val="B3241A"/>
+          <w:sz w:val="21"/>
+        </w:rPr>
+        <w:t xml:space="preserve">Location warning: </w:t>
+      </w:r>
+      <w:r>
+        <w:rPr>
+          <w:rFonts w:ascii="Calibri" w:hAnsi="Calibri" w:cs="Calibri" w:eastAsia="Calibri"/>
+          <w:b w:val="0"/>
+          <w:i w:val="0"/>
+          <w:color w:val="1A1A1A"/>
+          <w:sz w:val="21"/>
+        </w:rPr>
+        <w:t xml:space="preserve">a job shows an orange warning when location is not set to "Allow all the time", with a button to the phone's settings.</w:t>
+      </w:r>
+    </w:p>
+    <w:p>
+      <w:pPr>
+        <w:spacing w:after="60" w:line="264" w:lineRule="auto"/>
+        <w:ind w:left="403"/>
+      </w:pPr>
+      <w:r>
+        <w:rPr>
+          <w:rFonts w:ascii="Calibri" w:hAnsi="Calibri" w:cs="Calibri" w:eastAsia="Calibri"/>
+          <w:b/>
+          <w:i w:val="0"/>
+          <w:color w:val="B3241A"/>
+          <w:sz w:val="21"/>
+        </w:rPr>
+        <w:t xml:space="preserve">•  </w:t>
+      </w:r>
+      <w:r>
+        <w:rPr>
+          <w:rFonts w:ascii="Calibri" w:hAnsi="Calibri" w:cs="Calibri" w:eastAsia="Calibri"/>
+          <w:b/>
+          <w:i w:val="0"/>
+          <w:color w:val="B3241A"/>
+          <w:sz w:val="21"/>
+        </w:rPr>
+        <w:t xml:space="preserve">Crashes: </w:t>
+      </w:r>
+      <w:r>
+        <w:rPr>
+          <w:rFonts w:ascii="Calibri" w:hAnsi="Calibri" w:cs="Calibri" w:eastAsia="Calibri"/>
+          <w:b w:val="0"/>
+          <w:i w:val="0"/>
+          <w:color w:val="1A1A1A"/>
+          <w:sz w:val="21"/>
+        </w:rPr>
+        <w:t xml:space="preserve">if the app crashes, the details are kept on the phone and sent to the server, so the office can see what went wrong.</w:t>
+      </w:r>
+    </w:p>
+    <w:p>
+      <w:pPr>
+        <w:spacing w:after="120"/>
+      </w:pPr>
+    </w:p>
+    <w:tbl>
+      <w:tblPr>
+        <w:tblW w:type="auto" w:w="0"/>
+        <w:tblLayout w:type="fixed"/>
+        <w:tblBorders>
+          <w:top w:val="single" w:sz="6" w:space="0" w:color="DDDDDD"/>
+          <w:left w:val="single" w:sz="6" w:space="0" w:color="DDDDDD"/>
+          <w:bottom w:val="single" w:sz="6" w:space="0" w:color="DDDDDD"/>
+          <w:right w:val="single" w:sz="6" w:space="0" w:color="DDDDDD"/>
+        </w:tblBorders>
+      </w:tblPr>
+      <w:tblGrid>
+        <w:gridCol w:w="10123"/>
+      </w:tblGrid>
+      <w:tr>
+        <w:tc>
+          <w:tcPr>
+            <w:tcW w:type="dxa" w:w="10008"/>
+            <w:shd w:val="clear" w:color="auto" w:fill="FBE7E5"/>
+            <w:tcMar>
+              <w:top w:w="120" w:type="dxa"/>
+              <w:start w:w="160" w:type="dxa"/>
+              <w:bottom w:w="120" w:type="dxa"/>
+              <w:end w:w="160" w:type="dxa"/>
+            </w:tcMar>
+          </w:tcPr>
+          <w:p>
+            <w:pPr>
+              <w:spacing w:after="60"/>
+            </w:pPr>
+            <w:r>
+              <w:rPr>
+                <w:rFonts w:ascii="Calibri" w:hAnsi="Calibri" w:cs="Calibri" w:eastAsia="Calibri"/>
+                <w:b/>
+                <w:i w:val="0"/>
+                <w:color w:val="B3241A"/>
+                <w:sz w:val="22"/>
+              </w:rPr>
+              <w:t xml:space="preserve">Rule  —  "Allow all the time"</w:t>
+            </w:r>
+          </w:p>
+          <w:p>
+            <w:pPr>
+              <w:spacing w:after="0" w:line="269" w:lineRule="auto"/>
+            </w:pPr>
+            <w:r>
+              <w:rPr>
+                <w:rFonts w:ascii="Calibri" w:hAnsi="Calibri" w:cs="Calibri" w:eastAsia="Calibri"/>
+                <w:b w:val="0"/>
+                <w:i w:val="0"/>
+                <w:color w:val="1A1A1A"/>
+                <w:sz w:val="21"/>
+              </w:rPr>
+              <w:t xml:space="preserve">Every rider must set the app's location to "Allow all the time". With "Only while using the app" the phone goes quiet when the screen is off: the customer does not get the "rider is near" message and the office loses the rider on the map.</w:t>
+            </w:r>
+          </w:p>
+        </w:tc>
+      </w:tr>
+    </w:tbl>
+    <w:p>
+      <w:pPr>
+        <w:spacing w:after="120"/>
       </w:pPr>
     </w:p>
     <w:sectPr>

</xml_diff>